<commit_message>
new update of the document
</commit_message>
<xml_diff>
--- a/CouvertureMiguel.docx
+++ b/CouvertureMiguel.docx
@@ -114,20 +114,18 @@
                                 <w:rFonts w:ascii="Times New Roman" w:hAnsi="Times New Roman" w:cs="Times New Roman"/>
                                 <w:sz w:val="20"/>
                                 <w:szCs w:val="20"/>
+                                <w:lang w:val="en-US"/>
                               </w:rPr>
                             </w:pPr>
                             <w:r>
                               <w:rPr>
-                                <w:rFonts w:ascii="Times New Roman" w:hAnsi="Times New Roman" w:cs="Times New Roman"/>
                                 <w:noProof/>
-                                <w:sz w:val="20"/>
-                                <w:szCs w:val="20"/>
                               </w:rPr>
                               <w:drawing>
-                                <wp:inline distT="0" distB="0" distL="0" distR="0" wp14:anchorId="3D6FBD65" wp14:editId="15A874FC">
-                                  <wp:extent cx="1607820" cy="754380"/>
-                                  <wp:effectExtent l="0" t="0" r="0" b="7620"/>
-                                  <wp:docPr id="897218410" name="Picture 13"/>
+                                <wp:inline distT="0" distB="0" distL="0" distR="0" wp14:anchorId="7128A5B9" wp14:editId="3F6AA83D">
+                                  <wp:extent cx="695325" cy="603567"/>
+                                  <wp:effectExtent l="0" t="0" r="0" b="6350"/>
+                                  <wp:docPr id="2" name="Picture 2"/>
                                   <wp:cNvGraphicFramePr>
                                     <a:graphicFrameLocks xmlns:a="http://schemas.openxmlformats.org/drawingml/2006/main" noChangeAspect="1"/>
                                   </wp:cNvGraphicFramePr>
@@ -135,10 +133,8 @@
                                     <a:graphicData uri="http://schemas.openxmlformats.org/drawingml/2006/picture">
                                       <pic:pic xmlns:pic="http://schemas.openxmlformats.org/drawingml/2006/picture">
                                         <pic:nvPicPr>
-                                          <pic:cNvPr id="0" name="Picture 18"/>
-                                          <pic:cNvPicPr>
-                                            <a:picLocks noChangeAspect="1" noChangeArrowheads="1"/>
-                                          </pic:cNvPicPr>
+                                          <pic:cNvPr id="2" name="Picture 2"/>
+                                          <pic:cNvPicPr/>
                                         </pic:nvPicPr>
                                         <pic:blipFill>
                                           <a:blip r:embed="rId6">
@@ -148,23 +144,18 @@
                                               </a:ext>
                                             </a:extLst>
                                           </a:blip>
-                                          <a:srcRect/>
                                           <a:stretch>
                                             <a:fillRect/>
                                           </a:stretch>
                                         </pic:blipFill>
-                                        <pic:spPr bwMode="auto">
+                                        <pic:spPr>
                                           <a:xfrm>
                                             <a:off x="0" y="0"/>
-                                            <a:ext cx="1607820" cy="754380"/>
+                                            <a:ext cx="727203" cy="631239"/>
                                           </a:xfrm>
                                           <a:prstGeom prst="rect">
                                             <a:avLst/>
                                           </a:prstGeom>
-                                          <a:noFill/>
-                                          <a:ln>
-                                            <a:noFill/>
-                                          </a:ln>
                                         </pic:spPr>
                                       </pic:pic>
                                     </a:graphicData>
@@ -181,6 +172,7 @@
                                 <w:rFonts w:ascii="Times New Roman" w:hAnsi="Times New Roman" w:cs="Times New Roman"/>
                                 <w:sz w:val="20"/>
                                 <w:szCs w:val="20"/>
+                                <w:lang w:val="en-US"/>
                               </w:rPr>
                             </w:pPr>
                           </w:p>
@@ -192,6 +184,7 @@
                                 <w:rFonts w:ascii="Times New Roman" w:hAnsi="Times New Roman" w:cs="Times New Roman"/>
                                 <w:sz w:val="20"/>
                                 <w:szCs w:val="20"/>
+                                <w:lang w:val="fr-CM"/>
                               </w:rPr>
                             </w:pPr>
                             <w:r>
@@ -199,8 +192,18 @@
                                 <w:rFonts w:ascii="Times New Roman" w:hAnsi="Times New Roman" w:cs="Times New Roman"/>
                                 <w:sz w:val="20"/>
                                 <w:szCs w:val="20"/>
-                              </w:rPr>
-                              <w:t>PRECIOUS SERVICE IT</w:t>
+                                <w:lang w:val="fr-CM"/>
+                              </w:rPr>
+                              <w:t>Aéroports Du C</w:t>
+                            </w:r>
+                            <w:r>
+                              <w:rPr>
+                                <w:rFonts w:ascii="Times New Roman" w:hAnsi="Times New Roman" w:cs="Times New Roman"/>
+                                <w:sz w:val="20"/>
+                                <w:szCs w:val="20"/>
+                                <w:lang w:val="fr-CM"/>
+                              </w:rPr>
+                              <w:t>ameroun S.A</w:t>
                             </w:r>
                           </w:p>
                           <w:p>
@@ -211,6 +214,7 @@
                                 <w:rFonts w:ascii="Times New Roman" w:hAnsi="Times New Roman" w:cs="Times New Roman"/>
                                 <w:sz w:val="20"/>
                                 <w:szCs w:val="20"/>
+                                <w:lang w:val="fr-CM"/>
                               </w:rPr>
                             </w:pPr>
                             <w:r>
@@ -218,8 +222,27 @@
                                 <w:rFonts w:ascii="Times New Roman" w:hAnsi="Times New Roman" w:cs="Times New Roman"/>
                                 <w:sz w:val="20"/>
                                 <w:szCs w:val="20"/>
-                              </w:rPr>
-                              <w:t>ENTREPRISE INFORMATIQUE</w:t>
+                                <w:lang w:val="fr-CM"/>
+                              </w:rPr>
+                              <w:t xml:space="preserve">BP : </w:t>
+                            </w:r>
+                            <w:r>
+                              <w:rPr>
+                                <w:rFonts w:ascii="Times New Roman" w:hAnsi="Times New Roman" w:cs="Times New Roman"/>
+                                <w:sz w:val="20"/>
+                                <w:szCs w:val="20"/>
+                                <w:lang w:val="fr-CM"/>
+                              </w:rPr>
+                              <w:t>13615</w:t>
+                            </w:r>
+                            <w:r>
+                              <w:rPr>
+                                <w:rFonts w:ascii="Times New Roman" w:hAnsi="Times New Roman" w:cs="Times New Roman"/>
+                                <w:sz w:val="20"/>
+                                <w:szCs w:val="20"/>
+                                <w:lang w:val="fr-CM"/>
+                              </w:rPr>
+                              <w:t xml:space="preserve"> Yaoundé (Cameroun)</w:t>
                             </w:r>
                           </w:p>
                           <w:p>
@@ -230,6 +253,7 @@
                                 <w:rFonts w:ascii="Times New Roman" w:hAnsi="Times New Roman" w:cs="Times New Roman"/>
                                 <w:sz w:val="20"/>
                                 <w:szCs w:val="20"/>
+                                <w:lang w:val="en-US"/>
                               </w:rPr>
                             </w:pPr>
                             <w:r>
@@ -237,24 +261,60 @@
                                 <w:rFonts w:ascii="Times New Roman" w:hAnsi="Times New Roman" w:cs="Times New Roman"/>
                                 <w:sz w:val="20"/>
                                 <w:szCs w:val="20"/>
-                              </w:rPr>
-                              <w:t>BP</w:t>
-                            </w:r>
-                            <w:r>
-                              <w:rPr>
-                                <w:rFonts w:ascii="Times New Roman" w:hAnsi="Times New Roman" w:cs="Times New Roman"/>
-                                <w:sz w:val="20"/>
-                                <w:szCs w:val="20"/>
-                              </w:rPr>
-                              <w:t xml:space="preserve"> </w:t>
-                            </w:r>
-                            <w:r>
-                              <w:rPr>
-                                <w:rFonts w:ascii="Times New Roman" w:hAnsi="Times New Roman" w:cs="Times New Roman"/>
-                                <w:sz w:val="20"/>
-                                <w:szCs w:val="20"/>
-                              </w:rPr>
-                              <w:t>: 5823 Yaoundé (Cameroun)</w:t>
+                                <w:lang w:val="en-US"/>
+                              </w:rPr>
+                              <w:t>TEL:</w:t>
+                            </w:r>
+                            <w:r>
+                              <w:rPr>
+                                <w:rFonts w:ascii="Times New Roman" w:hAnsi="Times New Roman" w:cs="Times New Roman"/>
+                                <w:sz w:val="20"/>
+                                <w:szCs w:val="20"/>
+                                <w:lang w:val="en-US"/>
+                              </w:rPr>
+                              <w:t xml:space="preserve"> (237) </w:t>
+                            </w:r>
+                            <w:r>
+                              <w:rPr>
+                                <w:rFonts w:ascii="Times New Roman" w:hAnsi="Times New Roman" w:cs="Times New Roman"/>
+                                <w:sz w:val="20"/>
+                                <w:szCs w:val="20"/>
+                              </w:rPr>
+                              <w:t xml:space="preserve">6 </w:t>
+                            </w:r>
+                            <w:r>
+                              <w:rPr>
+                                <w:rFonts w:ascii="Times New Roman" w:hAnsi="Times New Roman" w:cs="Times New Roman"/>
+                                <w:sz w:val="20"/>
+                                <w:szCs w:val="20"/>
+                              </w:rPr>
+                              <w:t>222 233 602</w:t>
+                            </w:r>
+                            <w:r>
+                              <w:rPr>
+                                <w:rFonts w:ascii="Times New Roman" w:hAnsi="Times New Roman" w:cs="Times New Roman"/>
+                                <w:sz w:val="20"/>
+                                <w:szCs w:val="20"/>
+                                <w:lang w:val="en-US"/>
+                              </w:rPr>
+                              <w:t xml:space="preserve"> / </w:t>
+                            </w:r>
+                            <w:r>
+                              <w:rPr>
+                                <w:rFonts w:ascii="Times New Roman" w:hAnsi="Times New Roman" w:cs="Times New Roman"/>
+                                <w:sz w:val="20"/>
+                                <w:szCs w:val="20"/>
+                                <w:lang w:val="en-US"/>
+                              </w:rPr>
+                              <w:t xml:space="preserve">6 </w:t>
+                            </w:r>
+                            <w:r>
+                              <w:rPr>
+                                <w:rFonts w:ascii="Times New Roman" w:hAnsi="Times New Roman" w:cs="Times New Roman"/>
+                                <w:sz w:val="20"/>
+                                <w:szCs w:val="20"/>
+                              </w:rPr>
+                              <w:t>222 234 521</w:t>
                             </w:r>
                           </w:p>
                           <w:p>
@@ -265,6 +325,7 @@
                                 <w:rFonts w:ascii="Times New Roman" w:hAnsi="Times New Roman" w:cs="Times New Roman"/>
                                 <w:sz w:val="20"/>
                                 <w:szCs w:val="20"/>
+                                <w:lang w:val="en-US"/>
                               </w:rPr>
                             </w:pPr>
                             <w:r>
@@ -272,24 +333,33 @@
                                 <w:rFonts w:ascii="Times New Roman" w:hAnsi="Times New Roman" w:cs="Times New Roman"/>
                                 <w:sz w:val="20"/>
                                 <w:szCs w:val="20"/>
-                              </w:rPr>
-                              <w:t>TEL</w:t>
-                            </w:r>
-                            <w:r>
-                              <w:rPr>
-                                <w:rFonts w:ascii="Times New Roman" w:hAnsi="Times New Roman" w:cs="Times New Roman"/>
-                                <w:sz w:val="20"/>
-                                <w:szCs w:val="20"/>
+                                <w:lang w:val="en-US"/>
+                              </w:rPr>
+                              <w:t xml:space="preserve">Site </w:t>
+                            </w:r>
+                            <w:r>
+                              <w:rPr>
+                                <w:rFonts w:ascii="Times New Roman" w:hAnsi="Times New Roman" w:cs="Times New Roman"/>
+                                <w:sz w:val="20"/>
+                                <w:szCs w:val="20"/>
+                                <w:lang w:val="en-US"/>
+                              </w:rPr>
+                              <w:t>Web:</w:t>
+                            </w:r>
+                            <w:r>
+                              <w:rPr>
+                                <w:rFonts w:ascii="Times New Roman" w:hAnsi="Times New Roman" w:cs="Times New Roman"/>
+                                <w:sz w:val="20"/>
+                                <w:szCs w:val="20"/>
+                                <w:lang w:val="en-US"/>
                               </w:rPr>
                               <w:t xml:space="preserve"> </w:t>
                             </w:r>
                             <w:r>
                               <w:rPr>
-                                <w:rFonts w:ascii="Times New Roman" w:hAnsi="Times New Roman" w:cs="Times New Roman"/>
-                                <w:sz w:val="20"/>
-                                <w:szCs w:val="20"/>
-                              </w:rPr>
-                              <w:t>: (237) 6 99 34 91 76 / 6 56 64 36 35</w:t>
+                                <w:lang w:val="en-US"/>
+                              </w:rPr>
+                              <w:t>https://www.adcsa.info</w:t>
                             </w:r>
                           </w:p>
                           <w:p>
@@ -300,6 +370,7 @@
                                 <w:rFonts w:ascii="Times New Roman" w:hAnsi="Times New Roman" w:cs="Times New Roman"/>
                                 <w:sz w:val="20"/>
                                 <w:szCs w:val="20"/>
+                                <w:lang w:val="en-US"/>
                               </w:rPr>
                             </w:pPr>
                             <w:r>
@@ -307,34 +378,26 @@
                                 <w:rFonts w:ascii="Times New Roman" w:hAnsi="Times New Roman" w:cs="Times New Roman"/>
                                 <w:sz w:val="20"/>
                                 <w:szCs w:val="20"/>
-                              </w:rPr>
-                              <w:t>Site Web</w:t>
-                            </w:r>
-                            <w:r>
-                              <w:rPr>
-                                <w:rFonts w:ascii="Times New Roman" w:hAnsi="Times New Roman" w:cs="Times New Roman"/>
-                                <w:sz w:val="20"/>
-                                <w:szCs w:val="20"/>
+                                <w:lang w:val="en-US"/>
+                              </w:rPr>
+                              <w:t>E-mail:</w:t>
+                            </w:r>
+                            <w:r>
+                              <w:rPr>
+                                <w:rFonts w:ascii="Times New Roman" w:hAnsi="Times New Roman" w:cs="Times New Roman"/>
+                                <w:sz w:val="20"/>
+                                <w:szCs w:val="20"/>
+                                <w:lang w:val="en-US"/>
                               </w:rPr>
                               <w:t xml:space="preserve"> </w:t>
                             </w:r>
-                            <w:r>
-                              <w:rPr>
-                                <w:rFonts w:ascii="Times New Roman" w:hAnsi="Times New Roman" w:cs="Times New Roman"/>
-                                <w:sz w:val="20"/>
-                                <w:szCs w:val="20"/>
-                              </w:rPr>
-                              <w:t xml:space="preserve">: </w:t>
-                            </w:r>
-                            <w:hyperlink r:id="rId7" w:history="1">
+                            <w:hyperlink r:id="rId7" w:tgtFrame="_blank" w:history="1">
                               <w:r>
                                 <w:rPr>
                                   <w:rStyle w:val="Hyperlink"/>
-                                  <w:rFonts w:ascii="Times New Roman" w:hAnsi="Times New Roman" w:cs="Times New Roman"/>
-                                  <w:sz w:val="20"/>
-                                  <w:szCs w:val="20"/>
+                                  <w:rFonts w:ascii="Arial" w:hAnsi="Arial" w:cs="Arial"/>
                                 </w:rPr>
-                                <w:t>preciousserviceit.com</w:t>
+                                <w:t>contact@adcsa.aero</w:t>
                               </w:r>
                             </w:hyperlink>
                           </w:p>
@@ -346,36 +409,7 @@
                                 <w:rFonts w:ascii="Times New Roman" w:hAnsi="Times New Roman" w:cs="Times New Roman"/>
                                 <w:sz w:val="20"/>
                                 <w:szCs w:val="20"/>
-                              </w:rPr>
-                            </w:pPr>
-                            <w:r>
-                              <w:rPr>
-                                <w:rFonts w:ascii="Times New Roman" w:hAnsi="Times New Roman" w:cs="Times New Roman"/>
-                                <w:sz w:val="20"/>
-                                <w:szCs w:val="20"/>
-                              </w:rPr>
-                              <w:t xml:space="preserve">E-mail : </w:t>
-                            </w:r>
-                            <w:hyperlink r:id="rId8" w:history="1">
-                              <w:r>
-                                <w:rPr>
-                                  <w:rStyle w:val="Hyperlink"/>
-                                  <w:rFonts w:ascii="Times New Roman" w:hAnsi="Times New Roman" w:cs="Times New Roman"/>
-                                  <w:sz w:val="20"/>
-                                  <w:szCs w:val="20"/>
-                                </w:rPr>
-                                <w:t>preciservce@gmail.com</w:t>
-                              </w:r>
-                            </w:hyperlink>
-                          </w:p>
-                          <w:p>
-                            <w:pPr>
-                              <w:spacing w:after="0"/>
-                              <w:jc w:val="center"/>
-                              <w:rPr>
-                                <w:rFonts w:ascii="Times New Roman" w:hAnsi="Times New Roman" w:cs="Times New Roman"/>
-                                <w:sz w:val="20"/>
-                                <w:szCs w:val="20"/>
+                                <w:lang w:val="en-US"/>
                               </w:rPr>
                             </w:pPr>
                           </w:p>
@@ -399,7 +433,7 @@
               </wp:anchor>
             </w:drawing>
           </mc:Choice>
-          <mc:Fallback xmlns:w16cei="http://schemas.microsoft.com/office/word/2026/wordml/cei" xmlns:w16sdtfl="http://schemas.microsoft.com/office/word/2024/wordml/sdtformatlock" xmlns:w16du="http://schemas.microsoft.com/office/word/2023/wordml/word16du" xmlns:oel="http://schemas.microsoft.com/office/2019/extlst">
+          <mc:Fallback>
             <w:pict>
               <v:shapetype w14:anchorId="1F46548E" id="_x0000_t202" coordsize="21600,21600" o:spt="202" path="m,l,21600r21600,l21600,xe">
                 <v:stroke joinstyle="miter"/>
@@ -478,20 +512,18 @@
                           <w:rFonts w:ascii="Times New Roman" w:hAnsi="Times New Roman" w:cs="Times New Roman"/>
                           <w:sz w:val="20"/>
                           <w:szCs w:val="20"/>
+                          <w:lang w:val="en-US"/>
                         </w:rPr>
                       </w:pPr>
                       <w:r>
                         <w:rPr>
-                          <w:rFonts w:ascii="Times New Roman" w:hAnsi="Times New Roman" w:cs="Times New Roman"/>
                           <w:noProof/>
-                          <w:sz w:val="20"/>
-                          <w:szCs w:val="20"/>
                         </w:rPr>
                         <w:drawing>
-                          <wp:inline distT="0" distB="0" distL="0" distR="0" wp14:anchorId="3D6FBD65" wp14:editId="15A874FC">
-                            <wp:extent cx="1607820" cy="754380"/>
-                            <wp:effectExtent l="0" t="0" r="0" b="7620"/>
-                            <wp:docPr id="897218410" name="Picture 13"/>
+                          <wp:inline distT="0" distB="0" distL="0" distR="0" wp14:anchorId="7128A5B9" wp14:editId="3F6AA83D">
+                            <wp:extent cx="695325" cy="603567"/>
+                            <wp:effectExtent l="0" t="0" r="0" b="6350"/>
+                            <wp:docPr id="2" name="Picture 2"/>
                             <wp:cNvGraphicFramePr>
                               <a:graphicFrameLocks xmlns:a="http://schemas.openxmlformats.org/drawingml/2006/main" noChangeAspect="1"/>
                             </wp:cNvGraphicFramePr>
@@ -499,36 +531,29 @@
                               <a:graphicData uri="http://schemas.openxmlformats.org/drawingml/2006/picture">
                                 <pic:pic xmlns:pic="http://schemas.openxmlformats.org/drawingml/2006/picture">
                                   <pic:nvPicPr>
-                                    <pic:cNvPr id="0" name="Picture 18"/>
-                                    <pic:cNvPicPr>
-                                      <a:picLocks noChangeAspect="1" noChangeArrowheads="1"/>
-                                    </pic:cNvPicPr>
+                                    <pic:cNvPr id="2" name="Picture 2"/>
+                                    <pic:cNvPicPr/>
                                   </pic:nvPicPr>
                                   <pic:blipFill>
-                                    <a:blip r:embed="rId9">
+                                    <a:blip r:embed="rId6">
                                       <a:extLst>
                                         <a:ext uri="{28A0092B-C50C-407E-A947-70E740481C1C}">
                                           <a14:useLocalDpi xmlns:a14="http://schemas.microsoft.com/office/drawing/2010/main" val="0"/>
                                         </a:ext>
                                       </a:extLst>
                                     </a:blip>
-                                    <a:srcRect/>
                                     <a:stretch>
                                       <a:fillRect/>
                                     </a:stretch>
                                   </pic:blipFill>
-                                  <pic:spPr bwMode="auto">
+                                  <pic:spPr>
                                     <a:xfrm>
                                       <a:off x="0" y="0"/>
-                                      <a:ext cx="1607820" cy="754380"/>
+                                      <a:ext cx="727203" cy="631239"/>
                                     </a:xfrm>
                                     <a:prstGeom prst="rect">
                                       <a:avLst/>
                                     </a:prstGeom>
-                                    <a:noFill/>
-                                    <a:ln>
-                                      <a:noFill/>
-                                    </a:ln>
                                   </pic:spPr>
                                 </pic:pic>
                               </a:graphicData>
@@ -545,6 +570,7 @@
                           <w:rFonts w:ascii="Times New Roman" w:hAnsi="Times New Roman" w:cs="Times New Roman"/>
                           <w:sz w:val="20"/>
                           <w:szCs w:val="20"/>
+                          <w:lang w:val="en-US"/>
                         </w:rPr>
                       </w:pPr>
                     </w:p>
@@ -556,6 +582,7 @@
                           <w:rFonts w:ascii="Times New Roman" w:hAnsi="Times New Roman" w:cs="Times New Roman"/>
                           <w:sz w:val="20"/>
                           <w:szCs w:val="20"/>
+                          <w:lang w:val="fr-CM"/>
                         </w:rPr>
                       </w:pPr>
                       <w:r>
@@ -563,8 +590,18 @@
                           <w:rFonts w:ascii="Times New Roman" w:hAnsi="Times New Roman" w:cs="Times New Roman"/>
                           <w:sz w:val="20"/>
                           <w:szCs w:val="20"/>
-                        </w:rPr>
-                        <w:t>PRECIOUS SERVICE IT</w:t>
+                          <w:lang w:val="fr-CM"/>
+                        </w:rPr>
+                        <w:t>Aéroports Du C</w:t>
+                      </w:r>
+                      <w:r>
+                        <w:rPr>
+                          <w:rFonts w:ascii="Times New Roman" w:hAnsi="Times New Roman" w:cs="Times New Roman"/>
+                          <w:sz w:val="20"/>
+                          <w:szCs w:val="20"/>
+                          <w:lang w:val="fr-CM"/>
+                        </w:rPr>
+                        <w:t>ameroun S.A</w:t>
                       </w:r>
                     </w:p>
                     <w:p>
@@ -575,6 +612,7 @@
                           <w:rFonts w:ascii="Times New Roman" w:hAnsi="Times New Roman" w:cs="Times New Roman"/>
                           <w:sz w:val="20"/>
                           <w:szCs w:val="20"/>
+                          <w:lang w:val="fr-CM"/>
                         </w:rPr>
                       </w:pPr>
                       <w:r>
@@ -582,8 +620,27 @@
                           <w:rFonts w:ascii="Times New Roman" w:hAnsi="Times New Roman" w:cs="Times New Roman"/>
                           <w:sz w:val="20"/>
                           <w:szCs w:val="20"/>
-                        </w:rPr>
-                        <w:t>ENTREPRISE INFORMATIQUE</w:t>
+                          <w:lang w:val="fr-CM"/>
+                        </w:rPr>
+                        <w:t xml:space="preserve">BP : </w:t>
+                      </w:r>
+                      <w:r>
+                        <w:rPr>
+                          <w:rFonts w:ascii="Times New Roman" w:hAnsi="Times New Roman" w:cs="Times New Roman"/>
+                          <w:sz w:val="20"/>
+                          <w:szCs w:val="20"/>
+                          <w:lang w:val="fr-CM"/>
+                        </w:rPr>
+                        <w:t>13615</w:t>
+                      </w:r>
+                      <w:r>
+                        <w:rPr>
+                          <w:rFonts w:ascii="Times New Roman" w:hAnsi="Times New Roman" w:cs="Times New Roman"/>
+                          <w:sz w:val="20"/>
+                          <w:szCs w:val="20"/>
+                          <w:lang w:val="fr-CM"/>
+                        </w:rPr>
+                        <w:t xml:space="preserve"> Yaoundé (Cameroun)</w:t>
                       </w:r>
                     </w:p>
                     <w:p>
@@ -594,6 +651,7 @@
                           <w:rFonts w:ascii="Times New Roman" w:hAnsi="Times New Roman" w:cs="Times New Roman"/>
                           <w:sz w:val="20"/>
                           <w:szCs w:val="20"/>
+                          <w:lang w:val="en-US"/>
                         </w:rPr>
                       </w:pPr>
                       <w:r>
@@ -601,24 +659,60 @@
                           <w:rFonts w:ascii="Times New Roman" w:hAnsi="Times New Roman" w:cs="Times New Roman"/>
                           <w:sz w:val="20"/>
                           <w:szCs w:val="20"/>
-                        </w:rPr>
-                        <w:t>BP</w:t>
-                      </w:r>
-                      <w:r>
-                        <w:rPr>
-                          <w:rFonts w:ascii="Times New Roman" w:hAnsi="Times New Roman" w:cs="Times New Roman"/>
-                          <w:sz w:val="20"/>
-                          <w:szCs w:val="20"/>
-                        </w:rPr>
-                        <w:t xml:space="preserve"> </w:t>
-                      </w:r>
-                      <w:r>
-                        <w:rPr>
-                          <w:rFonts w:ascii="Times New Roman" w:hAnsi="Times New Roman" w:cs="Times New Roman"/>
-                          <w:sz w:val="20"/>
-                          <w:szCs w:val="20"/>
-                        </w:rPr>
-                        <w:t>: 5823 Yaoundé (Cameroun)</w:t>
+                          <w:lang w:val="en-US"/>
+                        </w:rPr>
+                        <w:t>TEL:</w:t>
+                      </w:r>
+                      <w:r>
+                        <w:rPr>
+                          <w:rFonts w:ascii="Times New Roman" w:hAnsi="Times New Roman" w:cs="Times New Roman"/>
+                          <w:sz w:val="20"/>
+                          <w:szCs w:val="20"/>
+                          <w:lang w:val="en-US"/>
+                        </w:rPr>
+                        <w:t xml:space="preserve"> (237) </w:t>
+                      </w:r>
+                      <w:r>
+                        <w:rPr>
+                          <w:rFonts w:ascii="Times New Roman" w:hAnsi="Times New Roman" w:cs="Times New Roman"/>
+                          <w:sz w:val="20"/>
+                          <w:szCs w:val="20"/>
+                        </w:rPr>
+                        <w:t xml:space="preserve">6 </w:t>
+                      </w:r>
+                      <w:r>
+                        <w:rPr>
+                          <w:rFonts w:ascii="Times New Roman" w:hAnsi="Times New Roman" w:cs="Times New Roman"/>
+                          <w:sz w:val="20"/>
+                          <w:szCs w:val="20"/>
+                        </w:rPr>
+                        <w:t>222 233 602</w:t>
+                      </w:r>
+                      <w:r>
+                        <w:rPr>
+                          <w:rFonts w:ascii="Times New Roman" w:hAnsi="Times New Roman" w:cs="Times New Roman"/>
+                          <w:sz w:val="20"/>
+                          <w:szCs w:val="20"/>
+                          <w:lang w:val="en-US"/>
+                        </w:rPr>
+                        <w:t xml:space="preserve"> / </w:t>
+                      </w:r>
+                      <w:r>
+                        <w:rPr>
+                          <w:rFonts w:ascii="Times New Roman" w:hAnsi="Times New Roman" w:cs="Times New Roman"/>
+                          <w:sz w:val="20"/>
+                          <w:szCs w:val="20"/>
+                          <w:lang w:val="en-US"/>
+                        </w:rPr>
+                        <w:t xml:space="preserve">6 </w:t>
+                      </w:r>
+                      <w:r>
+                        <w:rPr>
+                          <w:rFonts w:ascii="Times New Roman" w:hAnsi="Times New Roman" w:cs="Times New Roman"/>
+                          <w:sz w:val="20"/>
+                          <w:szCs w:val="20"/>
+                        </w:rPr>
+                        <w:t>222 234 521</w:t>
                       </w:r>
                     </w:p>
                     <w:p>
@@ -629,6 +723,7 @@
                           <w:rFonts w:ascii="Times New Roman" w:hAnsi="Times New Roman" w:cs="Times New Roman"/>
                           <w:sz w:val="20"/>
                           <w:szCs w:val="20"/>
+                          <w:lang w:val="en-US"/>
                         </w:rPr>
                       </w:pPr>
                       <w:r>
@@ -636,24 +731,33 @@
                           <w:rFonts w:ascii="Times New Roman" w:hAnsi="Times New Roman" w:cs="Times New Roman"/>
                           <w:sz w:val="20"/>
                           <w:szCs w:val="20"/>
-                        </w:rPr>
-                        <w:t>TEL</w:t>
-                      </w:r>
-                      <w:r>
-                        <w:rPr>
-                          <w:rFonts w:ascii="Times New Roman" w:hAnsi="Times New Roman" w:cs="Times New Roman"/>
-                          <w:sz w:val="20"/>
-                          <w:szCs w:val="20"/>
+                          <w:lang w:val="en-US"/>
+                        </w:rPr>
+                        <w:t xml:space="preserve">Site </w:t>
+                      </w:r>
+                      <w:r>
+                        <w:rPr>
+                          <w:rFonts w:ascii="Times New Roman" w:hAnsi="Times New Roman" w:cs="Times New Roman"/>
+                          <w:sz w:val="20"/>
+                          <w:szCs w:val="20"/>
+                          <w:lang w:val="en-US"/>
+                        </w:rPr>
+                        <w:t>Web:</w:t>
+                      </w:r>
+                      <w:r>
+                        <w:rPr>
+                          <w:rFonts w:ascii="Times New Roman" w:hAnsi="Times New Roman" w:cs="Times New Roman"/>
+                          <w:sz w:val="20"/>
+                          <w:szCs w:val="20"/>
+                          <w:lang w:val="en-US"/>
                         </w:rPr>
                         <w:t xml:space="preserve"> </w:t>
                       </w:r>
                       <w:r>
                         <w:rPr>
-                          <w:rFonts w:ascii="Times New Roman" w:hAnsi="Times New Roman" w:cs="Times New Roman"/>
-                          <w:sz w:val="20"/>
-                          <w:szCs w:val="20"/>
-                        </w:rPr>
-                        <w:t>: (237) 6 99 34 91 76 / 6 56 64 36 35</w:t>
+                          <w:lang w:val="en-US"/>
+                        </w:rPr>
+                        <w:t>https://www.adcsa.info</w:t>
                       </w:r>
                     </w:p>
                     <w:p>
@@ -664,6 +768,7 @@
                           <w:rFonts w:ascii="Times New Roman" w:hAnsi="Times New Roman" w:cs="Times New Roman"/>
                           <w:sz w:val="20"/>
                           <w:szCs w:val="20"/>
+                          <w:lang w:val="en-US"/>
                         </w:rPr>
                       </w:pPr>
                       <w:r>
@@ -671,34 +776,26 @@
                           <w:rFonts w:ascii="Times New Roman" w:hAnsi="Times New Roman" w:cs="Times New Roman"/>
                           <w:sz w:val="20"/>
                           <w:szCs w:val="20"/>
-                        </w:rPr>
-                        <w:t>Site Web</w:t>
-                      </w:r>
-                      <w:r>
-                        <w:rPr>
-                          <w:rFonts w:ascii="Times New Roman" w:hAnsi="Times New Roman" w:cs="Times New Roman"/>
-                          <w:sz w:val="20"/>
-                          <w:szCs w:val="20"/>
+                          <w:lang w:val="en-US"/>
+                        </w:rPr>
+                        <w:t>E-mail:</w:t>
+                      </w:r>
+                      <w:r>
+                        <w:rPr>
+                          <w:rFonts w:ascii="Times New Roman" w:hAnsi="Times New Roman" w:cs="Times New Roman"/>
+                          <w:sz w:val="20"/>
+                          <w:szCs w:val="20"/>
+                          <w:lang w:val="en-US"/>
                         </w:rPr>
                         <w:t xml:space="preserve"> </w:t>
                       </w:r>
-                      <w:r>
-                        <w:rPr>
-                          <w:rFonts w:ascii="Times New Roman" w:hAnsi="Times New Roman" w:cs="Times New Roman"/>
-                          <w:sz w:val="20"/>
-                          <w:szCs w:val="20"/>
-                        </w:rPr>
-                        <w:t xml:space="preserve">: </w:t>
-                      </w:r>
-                      <w:hyperlink r:id="rId10" w:history="1">
+                      <w:hyperlink r:id="rId8" w:tgtFrame="_blank" w:history="1">
                         <w:r>
                           <w:rPr>
                             <w:rStyle w:val="Hyperlink"/>
-                            <w:rFonts w:ascii="Times New Roman" w:hAnsi="Times New Roman" w:cs="Times New Roman"/>
-                            <w:sz w:val="20"/>
-                            <w:szCs w:val="20"/>
+                            <w:rFonts w:ascii="Arial" w:hAnsi="Arial" w:cs="Arial"/>
                           </w:rPr>
-                          <w:t>preciousserviceit.com</w:t>
+                          <w:t>contact@adcsa.aero</w:t>
                         </w:r>
                       </w:hyperlink>
                     </w:p>
@@ -710,36 +807,7 @@
                           <w:rFonts w:ascii="Times New Roman" w:hAnsi="Times New Roman" w:cs="Times New Roman"/>
                           <w:sz w:val="20"/>
                           <w:szCs w:val="20"/>
-                        </w:rPr>
-                      </w:pPr>
-                      <w:r>
-                        <w:rPr>
-                          <w:rFonts w:ascii="Times New Roman" w:hAnsi="Times New Roman" w:cs="Times New Roman"/>
-                          <w:sz w:val="20"/>
-                          <w:szCs w:val="20"/>
-                        </w:rPr>
-                        <w:t xml:space="preserve">E-mail : </w:t>
-                      </w:r>
-                      <w:hyperlink r:id="rId11" w:history="1">
-                        <w:r>
-                          <w:rPr>
-                            <w:rStyle w:val="Hyperlink"/>
-                            <w:rFonts w:ascii="Times New Roman" w:hAnsi="Times New Roman" w:cs="Times New Roman"/>
-                            <w:sz w:val="20"/>
-                            <w:szCs w:val="20"/>
-                          </w:rPr>
-                          <w:t>preciservce@gmail.com</w:t>
-                        </w:r>
-                      </w:hyperlink>
-                    </w:p>
-                    <w:p>
-                      <w:pPr>
-                        <w:spacing w:after="0"/>
-                        <w:jc w:val="center"/>
-                        <w:rPr>
-                          <w:rFonts w:ascii="Times New Roman" w:hAnsi="Times New Roman" w:cs="Times New Roman"/>
-                          <w:sz w:val="20"/>
-                          <w:szCs w:val="20"/>
+                          <w:lang w:val="en-US"/>
                         </w:rPr>
                       </w:pPr>
                     </w:p>
@@ -883,7 +951,7 @@
                                           </pic:cNvPicPr>
                                         </pic:nvPicPr>
                                         <pic:blipFill>
-                                          <a:blip r:embed="rId12">
+                                          <a:blip r:embed="rId9">
                                             <a:extLst>
                                               <a:ext uri="{28A0092B-C50C-407E-A947-70E740481C1C}">
                                                 <a14:useLocalDpi xmlns:a14="http://schemas.microsoft.com/office/drawing/2010/main" val="0"/>
@@ -1026,7 +1094,7 @@
                               </w:rPr>
                               <w:t xml:space="preserve">Site web: </w:t>
                             </w:r>
-                            <w:hyperlink r:id="rId13" w:history="1">
+                            <w:hyperlink r:id="rId10" w:history="1">
                               <w:r>
                                 <w:rPr>
                                   <w:rStyle w:val="Hyperlink"/>
@@ -1057,7 +1125,7 @@
                               </w:rPr>
                               <w:t xml:space="preserve">E-mail : </w:t>
                             </w:r>
-                            <w:hyperlink r:id="rId14" w:history="1">
+                            <w:hyperlink r:id="rId11" w:history="1">
                               <w:r>
                                 <w:rPr>
                                   <w:rStyle w:val="Hyperlink"/>
@@ -1103,11 +1171,7 @@
           </mc:Choice>
           <mc:Fallback>
             <w:pict>
-              <v:shapetype w14:anchorId="0A840F1D" id="_x0000_t202" coordsize="21600,21600" o:spt="202" path="m,l,21600r21600,l21600,xe">
-                <v:stroke joinstyle="miter"/>
-                <v:path gradientshapeok="t" o:connecttype="rect"/>
-              </v:shapetype>
-              <v:shape id="Text Box 4" o:spid="_x0000_s1027" type="#_x0000_t202" style="position:absolute;margin-left:-22.55pt;margin-top:-28.25pt;width:235.2pt;height:193.8pt;z-index:251662336;visibility:visible;mso-wrap-style:square;mso-width-percent:0;mso-height-percent:0;mso-wrap-distance-left:9pt;mso-wrap-distance-top:0;mso-wrap-distance-right:9pt;mso-wrap-distance-bottom:0;mso-position-horizontal:absolute;mso-position-horizontal-relative:text;mso-position-vertical:absolute;mso-position-vertical-relative:text;mso-width-percent:0;mso-height-percent:0;mso-width-relative:margin;mso-height-relative:margin;v-text-anchor:top" o:gfxdata="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" fillcolor="white [3201]" stroked="f" strokeweight=".5pt">
+              <v:shape w14:anchorId="0A840F1D" id="Text Box 4" o:spid="_x0000_s1027" type="#_x0000_t202" style="position:absolute;margin-left:-22.55pt;margin-top:-28.25pt;width:235.2pt;height:193.8pt;z-index:251662336;visibility:visible;mso-wrap-style:square;mso-width-percent:0;mso-height-percent:0;mso-wrap-distance-left:9pt;mso-wrap-distance-top:0;mso-wrap-distance-right:9pt;mso-wrap-distance-bottom:0;mso-position-horizontal:absolute;mso-position-horizontal-relative:text;mso-position-vertical:absolute;mso-position-vertical-relative:text;mso-width-percent:0;mso-height-percent:0;mso-width-relative:margin;mso-height-relative:margin;v-text-anchor:top" o:gfxdata="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" fillcolor="white [3201]" stroked="f" strokeweight=".5pt">
                 <v:textbox>
                   <w:txbxContent>
                     <w:p>
@@ -1202,7 +1266,7 @@
                                     </pic:cNvPicPr>
                                   </pic:nvPicPr>
                                   <pic:blipFill>
-                                    <a:blip r:embed="rId12">
+                                    <a:blip r:embed="rId9">
                                       <a:extLst>
                                         <a:ext uri="{28A0092B-C50C-407E-A947-70E740481C1C}">
                                           <a14:useLocalDpi xmlns:a14="http://schemas.microsoft.com/office/drawing/2010/main" val="0"/>
@@ -1345,7 +1409,7 @@
                         </w:rPr>
                         <w:t xml:space="preserve">Site web: </w:t>
                       </w:r>
-                      <w:hyperlink r:id="rId15" w:history="1">
+                      <w:hyperlink r:id="rId12" w:history="1">
                         <w:r>
                           <w:rPr>
                             <w:rStyle w:val="Hyperlink"/>
@@ -1376,7 +1440,7 @@
                         </w:rPr>
                         <w:t xml:space="preserve">E-mail : </w:t>
                       </w:r>
-                      <w:hyperlink r:id="rId16" w:history="1">
+                      <w:hyperlink r:id="rId13" w:history="1">
                         <w:r>
                           <w:rPr>
                             <w:rStyle w:val="Hyperlink"/>
@@ -2922,7 +2986,7 @@
       </w:r>
     </w:p>
     <w:sectPr>
-      <w:headerReference w:type="default" r:id="rId17"/>
+      <w:headerReference w:type="default" r:id="rId14"/>
       <w:pgSz w:w="11906" w:h="16838"/>
       <w:pgMar w:top="1417" w:right="1417" w:bottom="1417" w:left="1417" w:header="708" w:footer="708" w:gutter="0"/>
       <w:cols w:space="708"/>
@@ -3653,7 +3717,6 @@
   <w:style w:type="character" w:default="1" w:styleId="DefaultParagraphFont">
     <w:name w:val="Default Paragraph Font"/>
     <w:uiPriority w:val="1"/>
-    <w:semiHidden/>
     <w:unhideWhenUsed/>
   </w:style>
   <w:style w:type="table" w:default="1" w:styleId="TableNormal">

</xml_diff>